<commit_message>
Supply Chain Automation Added
</commit_message>
<xml_diff>
--- a/NIFTY_Custom_Screening_Report.docx
+++ b/NIFTY_Custom_Screening_Report.docx
@@ -12,28 +12,18 @@
     </w:p>
     <w:p>
       <w:r>
-        <w:t>Generated by: Hybrid Agentic AI &amp; Custom Strategy Directives</w:t>
-      </w:r>
-    </w:p>
-    <w:p>
-      <w:r>
         <w:rPr>
           <w:b/>
         </w:rPr>
         <w:br/>
-        <w:t>🏢 Bajaj Auto Ltd.</w:t>
-      </w:r>
-      <w:r>
-        <w:rPr>
-          <w:i/>
-        </w:rPr>
-        <w:t xml:space="preserve"> | Action: </w:t>
+        <w:t xml:space="preserve">🏢 Cipla Ltd. | Action: </w:t>
       </w:r>
       <w:r>
         <w:rPr>
           <w:b/>
+          <w:color w:val="B40000"/>
         </w:rPr>
-        <w:t>HOLD</w:t>
+        <w:t>SELL</w:t>
       </w:r>
     </w:p>
     <w:p>
@@ -43,7 +33,7 @@
     </w:p>
     <w:p>
       <w:r>
-        <w:t>While Bajaj Auto projects strong revenue growth to 603.86B by FY2026, the company exhibits significant concerns in FY2025, including a 5% decline in Net Income to 73.25B and a troubling shift to negative operating cash flow of -14.06B, largely due to a -90.60B change in working capital. Concurrently, the Debt/Assets ratio surged from 1.61% (FY2024) to 11.22% (FY2025), coupled with a sharp rise in interest expense to 3.89B, indicating increased leverage and financial burden. Despite a forecast rebound in FY2026, the substantial operational and financial risks presented in FY2025 necessitate a cautious approach to assess the sustainability of its performance.</w:t>
+        <w:t>Projected financial performance for FY2026 indicates a significant deceleration in revenue growth (2.09%) and a sharp decline in profitability metrics, with Net Profit Margin falling from 19.42% (FY2025) to 14.00% and Return on Assets decreasing from 14.10% to 9.13%. This strong reversal of previous positive trends signals potential operational challenges and warrants a divestment.</w:t>
       </w:r>
     </w:p>
     <w:p>
@@ -88,20 +78,14 @@
           <w:b/>
         </w:rPr>
         <w:br/>
-        <w:t>🏢 Bajaj Finance Ltd.</w:t>
-      </w:r>
-      <w:r>
-        <w:rPr>
-          <w:i/>
-        </w:rPr>
-        <w:t xml:space="preserve"> | Action: </w:t>
+        <w:t xml:space="preserve">🏢 Coal India Ltd. | Action: </w:t>
       </w:r>
       <w:r>
         <w:rPr>
           <w:b/>
-          <w:color w:val="008000"/>
+          <w:color w:val="B40000"/>
         </w:rPr>
-        <w:t>BUY</w:t>
+        <w:t>SELL</w:t>
       </w:r>
     </w:p>
     <w:p>
@@ -111,7 +95,7 @@
     </w:p>
     <w:p>
       <w:r>
-        <w:t>Bajaj Finance demonstrates consistent and robust growth, with total revenue projected to reach 496.65B and net income 190.17B by FY2026, indicating strong market position and operational efficiency. The company maintains impressively high Net Profit Margins, above 38% through FY2026, and a stable ROA for its sector (e.g., 3.40% in FY2026). Its financial model, characterized by significant debt issuance (1252.21B in FY2026) to fund growing lending operations, results in characteristic negative operating cash flows and strong positive financing cash flows, signifying healthy expansion for a non-banking financial company. This consistent growth, strong profitability, and effective capital deployment make it a compelling investment.</w:t>
+        <w:t>While FY2025 projects a substantial revenue increase, the company faces consistent and significant erosion in profitability. Net Profit Margin is projected to decline from 29.43% (FY2024) to 18.46% (FY2026), and Return on Assets is set to decrease from 15.74% to 10.89% over the same period. This indicates fundamental challenges in maintaining profitability despite revenue fluctuations, making it an unfavorable investment.</w:t>
       </w:r>
     </w:p>
     <w:p>

</xml_diff>